<commit_message>
feat: date picker, signature removal, per-jenis Drive folders, BA Pengujian logo upload
- All date fields use <input type="date"> with fan-out to Indonesian-format
  tags (hari/tanggal/bulan/tahun terbilang) via formatDate() in EditorModal
- Surat Tugas and BAKL get date range fields (mulai s/d selesai)
- All 5 DOCX masters regenerated without signature blocks (TTD images,
  stempel, Nadhif name, signer lines) via updated make-templates.py
- Drive folder routing per jenis BA: BAI/UID_JABAR→BAI, BAKL, BAP,
  BA_PENGUJIAN each to own folder via resolveFolderId() in gdrive.ts
- BA Pengujian: logo upload in EditorModal, per-doc subfolder created on
  save (PDF + DOCX + logo), DELETE removes whole subfolder
- .env.example synced with new GDRIVE_FOLDER_*_ID keys
- 36 unit tests pass (templates + date format coverage)

Co-Authored-By: Claude Sonnet 4.6 <noreply@anthropic.com>
</commit_message>
<xml_diff>
--- a/templates/docx/BAI.docx
+++ b/templates/docx/BAI.docx
@@ -533,37 +533,6 @@
       <w:pPr>
         <w:spacing w:after="0" w:line="240" w:lineRule="auto"/>
         <w:jc w:val="both"/>
-        <w:rPr>
-          <w:b w:val="1"/>
-          <w:bCs w:val="1"/>
-        </w:rPr>
-      </w:pPr>
-      <w:r>
-        <w:rPr>
-          <w:b w:val="1"/>
-          <w:bCs w:val="1"/>
-          <w:rtl w:val="0"/>
-        </w:rPr>
-        <w:t xml:space="preserve">Dan Penyedia Layanan PT PLN ICON PLUS</w:t>
-      </w:r>
-    </w:p>
-    <w:p>
-      <w:pPr>
-        <w:spacing w:after="0" w:line="240" w:lineRule="auto"/>
-        <w:jc w:val="both"/>
-        <w:rPr/>
-      </w:pPr>
-      <w:r>
-        <w:rPr>
-          <w:rtl w:val="0"/>
-        </w:rPr>
-        <w:t xml:space="preserve">Nama Project Team Leader : Nadhif Ahmad Dhialdien</w:t>
-      </w:r>
-    </w:p>
-    <w:p>
-      <w:pPr>
-        <w:spacing w:after="0" w:line="240" w:lineRule="auto"/>
-        <w:jc w:val="both"/>
         <w:rPr/>
       </w:pPr>
       <w:r>
@@ -739,35 +708,11 @@
           <w:tcPr>
             <w:vAlign w:val="center"/>
           </w:tcPr>
-          <w:p>
-            <w:pPr>
-              <w:jc w:val="center"/>
-              <w:rPr/>
-            </w:pPr>
-            <w:r>
-              <w:rPr>
-                <w:rtl w:val="0"/>
-              </w:rPr>
-              <w:t>( {ttdPelanggan} )</w:t>
-            </w:r>
-          </w:p>
         </w:tc>
         <w:tc>
           <w:tcPr>
             <w:vAlign w:val="center"/>
           </w:tcPr>
-          <w:p>
-            <w:pPr>
-              <w:jc w:val="center"/>
-              <w:rPr/>
-            </w:pPr>
-            <w:r>
-              <w:rPr>
-                <w:rtl w:val="0"/>
-              </w:rPr>
-              <w:t xml:space="preserve">  ( Nadhif Ahmad Dhialdien )</w:t>
-            </w:r>
-          </w:p>
         </w:tc>
       </w:tr>
     </w:tbl>

</xml_diff>

<commit_message>
feat: uploadable tanda tangan + stempel embedded in all templates
- Add {%ttd} and {%stempel} image tags at the PLN signature spot of all
  7 DOCX masters via scripts/add-ttd-tags.py (one tag per paragraph —
  the free image module renders only the first tag in a paragraph;
  excess blank paragraphs stripped from signature tables so the stacked
  images fit page 1)
- fillDocx renders data-URL images via docxtemplater-image-module-free
  + image-size, scaled to 45px height; missing upload renders an
  invisible 1x1 PNG
- EditorModal: upload/remove UI for both images on every template;
  values live inside the form data record so they persist through
  contentHtml with zero API or schema changes
- Verified: 44 tests pass, live preview shows both marks on page 1

Co-Authored-By: Claude Fable 5 <noreply@anthropic.com>
</commit_message>
<xml_diff>
--- a/templates/docx/BAI.docx
+++ b/templates/docx/BAI.docx
@@ -696,6 +696,14 @@
                 <w:rtl w:val="0"/>
               </w:rPr>
             </w:r>
+            <w:r>
+              <w:t>{%ttd}</w:t>
+            </w:r>
+          </w:p>
+          <w:p>
+            <w:r>
+              <w:t>{%stempel}</w:t>
+            </w:r>
           </w:p>
         </w:tc>
       </w:tr>

</xml_diff>

<commit_message>
fix: retag2 — clean remaining dots/literals in BAI, UID_JABAR, BAST
retag.py's `if '{' in para.text: return` guard skipped paragraphs that
already had one tag but still contained dots/literals elsewhere.
scripts/retag2.py patches 5 missed spots:
- BAI p1: namaLayanan + namaPelanggan (was dots)
- BAI p12: terminating (was dots)
- UID_JABAR p1: prefilled literal layanan/pelanggan → tags
- UID_JABAR p12: prefilled literal GEDUNG BALAI SUMUR → {terminating}
- BAST t0r2c3: stray dots paragraph after {berkedudukanPihakPertama}

Fixed PLN addresses in BAKL and BA_PENGUJIAN kept as-is (prefilled data).

Co-Authored-By: Claude Sonnet 4.6 <noreply@anthropic.com>
</commit_message>
<xml_diff>
--- a/templates/docx/BAI.docx
+++ b/templates/docx/BAI.docx
@@ -29,7 +29,7 @@
         <w:rPr>
           <w:rtl w:val="0"/>
         </w:rPr>
-        <w:t>Pada hari ini {hari} Tanggal {tanggal} Bulan {bulan} Tahun {tahun} telah dilakukan pekerjaan aktivasi layanan……………………………. yang disewa oleh ………………………………………. Dengan hasil BAIK, Adapun spesifikasi sebagai berikut:</w:t>
+        <w:t>Pada hari ini {hari} Tanggal {tanggal} Bulan {bulan} Tahun {tahun} telah dilakukan pekerjaan aktivasi layanan{namaLayanan} yang disewa oleh {namaPelanggan} Dengan hasil BAIK, Adapun spesifikasi sebagai berikut:</w:t>
       </w:r>
       <w:r>
         <w:rPr>
@@ -260,9 +260,9 @@
         <w:rPr>
           <w:rtl w:val="0"/>
         </w:rPr>
-        <w:t xml:space="preserve">Terminating</w:t>
-        <w:tab/>
-        <w:t xml:space="preserve">: ……………………………………….</w:t>
+        <w:t>Terminating</w:t>
+        <w:tab/>
+        <w:t>: {terminating}</w:t>
       </w:r>
     </w:p>
     <w:p>

</xml_diff>

<commit_message>
fix(templates): correct BAI spacing/alignment and remove duplicate terminating
</commit_message>
<xml_diff>
--- a/templates/docx/BAI.docx
+++ b/templates/docx/BAI.docx
@@ -1,6 +1,6 @@
 
 <file path=word/document.xml><?xml version="1.0" encoding="utf-8"?>
-<w:document xmlns:mc="http://schemas.openxmlformats.org/markup-compatibility/2006" xmlns:o="urn:schemas-microsoft-com:office:office" xmlns:r="http://schemas.openxmlformats.org/officeDocument/2006/relationships" xmlns:m="http://schemas.openxmlformats.org/officeDocument/2006/math" xmlns:v="urn:schemas-microsoft-com:vml" xmlns:wp="http://schemas.openxmlformats.org/drawingml/2006/wordprocessingDrawing" xmlns:w10="urn:schemas-microsoft-com:office:word" xmlns:w="http://schemas.openxmlformats.org/wordprocessingml/2006/main" xmlns:wne="http://schemas.microsoft.com/office/word/2006/wordml" xmlns:sl="http://schemas.openxmlformats.org/schemaLibrary/2006/main" xmlns:a="http://schemas.openxmlformats.org/drawingml/2006/main" xmlns:pic="http://schemas.openxmlformats.org/drawingml/2006/picture" xmlns:c="http://schemas.openxmlformats.org/drawingml/2006/chart" xmlns:lc="http://schemas.openxmlformats.org/drawingml/2006/lockedCanvas" xmlns:dgm="http://schemas.openxmlformats.org/drawingml/2006/diagram" xmlns:wps="http://schemas.microsoft.com/office/word/2010/wordprocessingShape" xmlns:wpg="http://schemas.microsoft.com/office/word/2010/wordprocessingGroup" xmlns:w14="http://schemas.microsoft.com/office/word/2010/wordml" xmlns:w15="http://schemas.microsoft.com/office/word/2012/wordml" xmlns:w16="http://schemas.microsoft.com/office/word/2018/wordml" xmlns:w16cex="http://schemas.microsoft.com/office/word/2018/wordml/cex" xmlns:w16cid="http://schemas.microsoft.com/office/word/2016/wordml/cid" xmlns="http://schemas.microsoft.com/office/tasks/2019/documenttasks" xmlns:cr="http://schemas.microsoft.com/office/comments/2020/reactions">
+<w:document xmlns:r="http://schemas.openxmlformats.org/officeDocument/2006/relationships" xmlns:w="http://schemas.openxmlformats.org/wordprocessingml/2006/main" xmlns:w14="http://schemas.microsoft.com/office/word/2010/wordml">
   <w:body>
     <w:p>
       <w:pPr>
@@ -29,7 +29,7 @@
         <w:rPr>
           <w:rtl w:val="0"/>
         </w:rPr>
-        <w:t>Pada hari ini {hari} Tanggal {tanggal} Bulan {bulan} Tahun {tahun} telah dilakukan pekerjaan aktivasi layanan{namaLayanan} yang disewa oleh {namaPelanggan} Dengan hasil BAIK, Adapun spesifikasi sebagai berikut:</w:t>
+        <w:t>Pada hari ini {hari} Tanggal {tanggal} Bulan {bulan} Tahun {tahun} telah dilakukan pekerjaan aktivasi layanan {namaLayanan} yang disewa oleh {namaPelanggan} Dengan hasil BAIK, Adapun spesifikasi sebagai berikut:</w:t>
       </w:r>
       <w:r>
         <w:rPr>
@@ -106,12 +106,12 @@
     </w:p>
     <w:p>
       <w:pPr>
-        <w:tabs>
-          <w:tab w:val="left" w:leader="none" w:pos="2127"/>
-        </w:tabs>
-        <w:spacing w:after="0" w:line="240" w:lineRule="auto"/>
-        <w:jc w:val="both"/>
-        <w:rPr/>
+        <w:spacing w:after="0" w:line="240" w:lineRule="auto"/>
+        <w:jc w:val="both"/>
+        <w:rPr/>
+        <w:tabs>
+          <w:tab w:val="left" w:pos="2880"/>
+        </w:tabs>
       </w:pPr>
       <w:r>
         <w:rPr>
@@ -124,12 +124,12 @@
     </w:p>
     <w:p>
       <w:pPr>
-        <w:tabs>
-          <w:tab w:val="left" w:leader="none" w:pos="2127"/>
-        </w:tabs>
-        <w:spacing w:after="0" w:line="240" w:lineRule="auto"/>
-        <w:jc w:val="both"/>
-        <w:rPr/>
+        <w:spacing w:after="0" w:line="240" w:lineRule="auto"/>
+        <w:jc w:val="both"/>
+        <w:rPr/>
+        <w:tabs>
+          <w:tab w:val="left" w:pos="2880"/>
+        </w:tabs>
       </w:pPr>
       <w:r>
         <w:rPr>
@@ -142,12 +142,12 @@
     </w:p>
     <w:p>
       <w:pPr>
-        <w:tabs>
-          <w:tab w:val="left" w:leader="none" w:pos="2127"/>
-        </w:tabs>
-        <w:spacing w:after="0" w:line="240" w:lineRule="auto"/>
-        <w:jc w:val="both"/>
-        <w:rPr/>
+        <w:spacing w:after="0" w:line="240" w:lineRule="auto"/>
+        <w:jc w:val="both"/>
+        <w:rPr/>
+        <w:tabs>
+          <w:tab w:val="left" w:pos="2880"/>
+        </w:tabs>
       </w:pPr>
       <w:r>
         <w:rPr>
@@ -160,12 +160,12 @@
     </w:p>
     <w:p>
       <w:pPr>
-        <w:tabs>
-          <w:tab w:val="left" w:leader="none" w:pos="2127"/>
-        </w:tabs>
-        <w:spacing w:after="0" w:line="240" w:lineRule="auto"/>
-        <w:jc w:val="both"/>
-        <w:rPr/>
+        <w:spacing w:after="0" w:line="240" w:lineRule="auto"/>
+        <w:jc w:val="both"/>
+        <w:rPr/>
+        <w:tabs>
+          <w:tab w:val="left" w:pos="2880"/>
+        </w:tabs>
       </w:pPr>
       <w:r>
         <w:rPr>
@@ -182,6 +182,9 @@
         <w:ind w:left="2127" w:hanging="2127"/>
         <w:jc w:val="both"/>
         <w:rPr/>
+        <w:tabs>
+          <w:tab w:val="left" w:pos="2880"/>
+        </w:tabs>
       </w:pPr>
       <w:r>
         <w:rPr>
@@ -197,6 +200,9 @@
         <w:spacing w:after="0" w:line="240" w:lineRule="auto"/>
         <w:ind w:left="2127" w:right="-755" w:hanging="2127"/>
         <w:rPr/>
+        <w:tabs>
+          <w:tab w:val="left" w:pos="2880"/>
+        </w:tabs>
       </w:pPr>
       <w:r>
         <w:rPr>
@@ -212,6 +218,9 @@
         <w:spacing w:after="0" w:line="240" w:lineRule="auto"/>
         <w:ind w:left="2127" w:right="-755" w:hanging="2127"/>
         <w:rPr/>
+        <w:tabs>
+          <w:tab w:val="left" w:pos="2880"/>
+        </w:tabs>
       </w:pPr>
       <w:r>
         <w:rPr>
@@ -240,6 +249,9 @@
         <w:ind w:left="2127" w:hanging="2127"/>
         <w:jc w:val="both"/>
         <w:rPr/>
+        <w:tabs>
+          <w:tab w:val="left" w:pos="2880"/>
+        </w:tabs>
       </w:pPr>
       <w:r>
         <w:rPr>
@@ -252,23 +264,8 @@
     </w:p>
     <w:p>
       <w:pPr>
-        <w:spacing w:after="0" w:line="240" w:lineRule="auto"/>
-        <w:ind w:left="2127" w:right="-755" w:hanging="2127"/>
-        <w:rPr/>
-      </w:pPr>
-      <w:r>
-        <w:rPr>
-          <w:rtl w:val="0"/>
-        </w:rPr>
-        <w:t>Terminating</w:t>
-        <w:tab/>
-        <w:t>: {terminating}</w:t>
-      </w:r>
-    </w:p>
-    <w:p>
-      <w:pPr>
-        <w:tabs>
-          <w:tab w:val="left" w:leader="none" w:pos="2127"/>
+        <w:tabs>
+          <w:tab w:val="left" w:leader="none" w:pos="2880"/>
         </w:tabs>
         <w:spacing w:after="0" w:line="240" w:lineRule="auto"/>
         <w:ind w:left="2268" w:right="-755" w:firstLine="0"/>
@@ -282,14 +279,12 @@
     </w:p>
     <w:p>
       <w:pPr>
-        <w:tabs>
-          <w:tab w:val="left" w:leader="none" w:pos="2127"/>
-          <w:tab w:val="left" w:leader="none" w:pos="7088"/>
-          <w:tab w:val="left" w:leader="none" w:pos="8364"/>
-        </w:tabs>
-        <w:spacing w:after="0" w:line="240" w:lineRule="auto"/>
-        <w:jc w:val="both"/>
-        <w:rPr/>
+        <w:spacing w:after="0" w:line="240" w:lineRule="auto"/>
+        <w:jc w:val="both"/>
+        <w:rPr/>
+        <w:tabs>
+          <w:tab w:val="left" w:pos="2880"/>
+        </w:tabs>
       </w:pPr>
       <w:r>
         <w:rPr>
@@ -304,13 +299,12 @@
     </w:p>
     <w:p>
       <w:pPr>
-        <w:tabs>
-          <w:tab w:val="left" w:leader="none" w:pos="2127"/>
-          <w:tab w:val="left" w:leader="none" w:pos="7088"/>
-        </w:tabs>
-        <w:spacing w:after="0" w:line="240" w:lineRule="auto"/>
-        <w:jc w:val="both"/>
-        <w:rPr/>
+        <w:spacing w:after="0" w:line="240" w:lineRule="auto"/>
+        <w:jc w:val="both"/>
+        <w:rPr/>
+        <w:tabs>
+          <w:tab w:val="left" w:pos="2880"/>
+        </w:tabs>
       </w:pPr>
       <w:r>
         <w:rPr>
@@ -323,13 +317,12 @@
     </w:p>
     <w:p>
       <w:pPr>
-        <w:tabs>
-          <w:tab w:val="left" w:leader="none" w:pos="2127"/>
-          <w:tab w:val="left" w:leader="none" w:pos="7088"/>
-        </w:tabs>
-        <w:spacing w:after="0" w:line="240" w:lineRule="auto"/>
-        <w:jc w:val="both"/>
-        <w:rPr/>
+        <w:spacing w:after="0" w:line="240" w:lineRule="auto"/>
+        <w:jc w:val="both"/>
+        <w:rPr/>
+        <w:tabs>
+          <w:tab w:val="left" w:pos="2880"/>
+        </w:tabs>
       </w:pPr>
       <w:r>
         <w:rPr>
@@ -342,13 +335,12 @@
     </w:p>
     <w:p>
       <w:pPr>
-        <w:tabs>
-          <w:tab w:val="left" w:leader="none" w:pos="2127"/>
-          <w:tab w:val="left" w:leader="none" w:pos="7088"/>
-        </w:tabs>
-        <w:spacing w:after="0" w:line="240" w:lineRule="auto"/>
-        <w:jc w:val="both"/>
-        <w:rPr/>
+        <w:spacing w:after="0" w:line="240" w:lineRule="auto"/>
+        <w:jc w:val="both"/>
+        <w:rPr/>
+        <w:tabs>
+          <w:tab w:val="left" w:pos="2880"/>
+        </w:tabs>
       </w:pPr>
       <w:r>
         <w:rPr>
@@ -363,13 +355,12 @@
     </w:p>
     <w:p>
       <w:pPr>
-        <w:tabs>
-          <w:tab w:val="left" w:leader="none" w:pos="2127"/>
-          <w:tab w:val="left" w:leader="none" w:pos="7088"/>
-        </w:tabs>
-        <w:spacing w:after="0" w:line="240" w:lineRule="auto"/>
-        <w:jc w:val="both"/>
-        <w:rPr/>
+        <w:spacing w:after="0" w:line="240" w:lineRule="auto"/>
+        <w:jc w:val="both"/>
+        <w:rPr/>
+        <w:tabs>
+          <w:tab w:val="left" w:pos="2880"/>
+        </w:tabs>
       </w:pPr>
       <w:r>
         <w:rPr>
@@ -382,13 +373,12 @@
     </w:p>
     <w:p>
       <w:pPr>
-        <w:tabs>
-          <w:tab w:val="left" w:leader="none" w:pos="2127"/>
-          <w:tab w:val="left" w:leader="none" w:pos="7088"/>
-        </w:tabs>
-        <w:spacing w:after="0" w:line="240" w:lineRule="auto"/>
-        <w:jc w:val="both"/>
-        <w:rPr/>
+        <w:spacing w:after="0" w:line="240" w:lineRule="auto"/>
+        <w:jc w:val="both"/>
+        <w:rPr/>
+        <w:tabs>
+          <w:tab w:val="left" w:pos="2880"/>
+        </w:tabs>
       </w:pPr>
       <w:r>
         <w:rPr>
@@ -402,22 +392,22 @@
     <w:p>
       <w:pPr>
         <w:tabs>
-          <w:tab w:val="left" w:leader="none" w:pos="2127"/>
-        </w:tabs>
-        <w:spacing w:after="0" w:line="240" w:lineRule="auto"/>
-        <w:jc w:val="both"/>
-        <w:rPr/>
-      </w:pPr>
-      <w:r>
-        <w:rPr>
-          <w:rtl w:val="0"/>
-        </w:rPr>
-      </w:r>
-    </w:p>
-    <w:p>
-      <w:pPr>
-        <w:tabs>
-          <w:tab w:val="left" w:leader="none" w:pos="2127"/>
+          <w:tab w:val="left" w:leader="none" w:pos="2880"/>
+        </w:tabs>
+        <w:spacing w:after="0" w:line="240" w:lineRule="auto"/>
+        <w:jc w:val="both"/>
+        <w:rPr/>
+      </w:pPr>
+      <w:r>
+        <w:rPr>
+          <w:rtl w:val="0"/>
+        </w:rPr>
+      </w:r>
+    </w:p>
+    <w:p>
+      <w:pPr>
+        <w:tabs>
+          <w:tab w:val="left" w:leader="none" w:pos="2880"/>
         </w:tabs>
         <w:spacing w:after="0" w:line="240" w:lineRule="auto"/>
         <w:jc w:val="both"/>
@@ -437,12 +427,12 @@
     </w:p>
     <w:p>
       <w:pPr>
-        <w:tabs>
-          <w:tab w:val="left" w:leader="none" w:pos="2127"/>
-        </w:tabs>
-        <w:spacing w:after="0" w:line="240" w:lineRule="auto"/>
-        <w:jc w:val="both"/>
-        <w:rPr/>
+        <w:spacing w:after="0" w:line="240" w:lineRule="auto"/>
+        <w:jc w:val="both"/>
+        <w:rPr/>
+        <w:tabs>
+          <w:tab w:val="left" w:pos="2880"/>
+        </w:tabs>
       </w:pPr>
       <w:r>
         <w:rPr>
@@ -455,12 +445,12 @@
     </w:p>
     <w:p>
       <w:pPr>
-        <w:tabs>
-          <w:tab w:val="left" w:leader="none" w:pos="2127"/>
-        </w:tabs>
-        <w:spacing w:after="0" w:line="240" w:lineRule="auto"/>
-        <w:jc w:val="both"/>
-        <w:rPr/>
+        <w:spacing w:after="0" w:line="240" w:lineRule="auto"/>
+        <w:jc w:val="both"/>
+        <w:rPr/>
+        <w:tabs>
+          <w:tab w:val="left" w:pos="2880"/>
+        </w:tabs>
       </w:pPr>
       <w:r>
         <w:rPr>
@@ -473,12 +463,12 @@
     </w:p>
     <w:p>
       <w:pPr>
-        <w:tabs>
-          <w:tab w:val="left" w:leader="none" w:pos="2127"/>
-        </w:tabs>
-        <w:spacing w:after="0" w:line="240" w:lineRule="auto"/>
-        <w:jc w:val="both"/>
-        <w:rPr/>
+        <w:spacing w:after="0" w:line="240" w:lineRule="auto"/>
+        <w:jc w:val="both"/>
+        <w:rPr/>
+        <w:tabs>
+          <w:tab w:val="left" w:pos="2880"/>
+        </w:tabs>
       </w:pPr>
       <w:r>
         <w:rPr>
@@ -492,7 +482,7 @@
     <w:p>
       <w:pPr>
         <w:tabs>
-          <w:tab w:val="left" w:leader="none" w:pos="2127"/>
+          <w:tab w:val="left" w:leader="none" w:pos="2880"/>
         </w:tabs>
         <w:spacing w:after="0" w:line="240" w:lineRule="auto"/>
         <w:jc w:val="both"/>
@@ -637,7 +627,7 @@
           <w:p>
             <w:pPr>
               <w:tabs>
-                <w:tab w:val="left" w:leader="none" w:pos="2127"/>
+                <w:tab w:val="left" w:leader="none" w:pos="2880"/>
               </w:tabs>
               <w:jc w:val="center"/>
               <w:rPr>

</xml_diff>

<commit_message>
fix: template layout revisions, dashboard riwayat dokumen, hapus Nota Dinas
- rapikan alignment/bold/spasi/TTD di 7 template docx (Surat Tugas, BAI,
  UID JABAR, BAKL, BAST, BA Pengujian, NODIN)
- fix drag TTD pihak kedua (ttd2/stempel2) yang sebelumnya diabaikan
- nama file otomatis dari nomor surat / no PA / perihal, konsisten per template
- hapus Nota Dinas dari menu, reorder template BAI UID JABAR & BA Pengujian
- dashboard: hero PLN Icon Plus SBU Jabar + riwayat dokumen (filter folder,
  search nama berkas, dropdown bulan/tahun dari data asli)
</commit_message>
<xml_diff>
--- a/templates/docx/BAI.docx
+++ b/templates/docx/BAI.docx
@@ -27,401 +27,414 @@
       </w:pPr>
       <w:r>
         <w:rPr>
-          <w:rtl w:val="0"/>
-        </w:rPr>
-        <w:t>Pada hari ini {hari} Tanggal {tanggal} Bulan {bulan} Tahun {tahun} telah dilakukan pekerjaan aktivasi layanan {namaLayanan} yang disewa oleh {namaPelanggan} Dengan hasil BAIK, Adapun spesifikasi sebagai berikut:</w:t>
-      </w:r>
-      <w:r>
+          <w:b w:val="0"/>
+          <w:rtl w:val="0"/>
+        </w:rPr>
+        <w:t xml:space="preserve">Pada hari ini </w:t>
+      </w:r>
+      <w:r>
+        <w:rPr>
+          <w:b/>
+          <w:rtl w:val="0"/>
+        </w:rPr>
+        <w:t>{hari}</w:t>
+      </w:r>
+      <w:r>
+        <w:rPr>
+          <w:b w:val="0"/>
+          <w:rtl w:val="0"/>
+        </w:rPr>
+        <w:t xml:space="preserve"> Tanggal </w:t>
+      </w:r>
+      <w:r>
+        <w:rPr>
+          <w:b/>
+          <w:rtl w:val="0"/>
+        </w:rPr>
+        <w:t>{tanggal}</w:t>
+      </w:r>
+      <w:r>
+        <w:rPr>
+          <w:b w:val="0"/>
+          <w:rtl w:val="0"/>
+        </w:rPr>
+        <w:t xml:space="preserve"> Bulan </w:t>
+      </w:r>
+      <w:r>
+        <w:rPr>
+          <w:b/>
+          <w:rtl w:val="0"/>
+        </w:rPr>
+        <w:t>{bulan}</w:t>
+      </w:r>
+      <w:r>
+        <w:rPr>
+          <w:b w:val="0"/>
+          <w:rtl w:val="0"/>
+        </w:rPr>
+        <w:t xml:space="preserve"> Tahun </w:t>
+      </w:r>
+      <w:r>
+        <w:rPr>
+          <w:b/>
+          <w:rtl w:val="0"/>
+        </w:rPr>
+        <w:t>{tahun}</w:t>
+      </w:r>
+      <w:r>
+        <w:rPr>
+          <w:b w:val="0"/>
+          <w:rtl w:val="0"/>
+        </w:rPr>
+        <w:t xml:space="preserve"> telah dilakukan pekerjaan aktivasi layanan {namaLayanan} yang disewa oleh {namaPelanggan} Dengan hasil </w:t>
+      </w:r>
+      <w:r>
+        <w:rPr>
+          <w:b/>
+          <w:rtl w:val="0"/>
+        </w:rPr>
+        <w:t>BAIK</w:t>
+      </w:r>
+      <w:r>
+        <w:rPr>
+          <w:b w:val="0"/>
+          <w:rtl w:val="0"/>
+        </w:rPr>
+        <w:t>, Adapun spesifikasi sebagai berikut:</w:t>
+      </w:r>
+    </w:p>
+    <w:p>
+      <w:pPr>
+        <w:spacing w:after="0" w:line="240" w:lineRule="auto"/>
+        <w:jc w:val="both"/>
+        <w:rPr/>
+      </w:pPr>
+      <w:r>
+        <w:rPr>
+          <w:rtl w:val="0"/>
+        </w:rPr>
+      </w:r>
+    </w:p>
+    <w:p>
+      <w:pPr>
+        <w:spacing w:after="0" w:line="240" w:lineRule="auto"/>
+        <w:jc w:val="both"/>
+        <w:rPr/>
+        <w:tabs>
+          <w:tab w:val="left" w:pos="3020"/>
+        </w:tabs>
+      </w:pPr>
+      <w:r>
+        <w:rPr>
+          <w:rtl w:val="0"/>
+        </w:rPr>
+        <w:t xml:space="preserve">Nama Layanan </w:t>
+        <w:tab/>
+        <w:t>: {namaLayanan}</w:t>
+      </w:r>
+    </w:p>
+    <w:p>
+      <w:pPr>
+        <w:spacing w:after="0" w:line="240" w:lineRule="auto"/>
+        <w:jc w:val="both"/>
+        <w:rPr/>
+        <w:tabs>
+          <w:tab w:val="left" w:pos="3020"/>
+        </w:tabs>
+      </w:pPr>
+      <w:r>
+        <w:rPr>
+          <w:rtl w:val="0"/>
+        </w:rPr>
+        <w:t>Service ID</w:t>
+        <w:tab/>
+        <w:t>: {serviceId}</w:t>
+      </w:r>
+    </w:p>
+    <w:p>
+      <w:pPr>
+        <w:spacing w:after="0" w:line="240" w:lineRule="auto"/>
+        <w:jc w:val="both"/>
+        <w:rPr/>
+        <w:tabs>
+          <w:tab w:val="left" w:pos="3020"/>
+        </w:tabs>
+      </w:pPr>
+      <w:r>
+        <w:rPr>
+          <w:rtl w:val="0"/>
+        </w:rPr>
+        <w:t>Interface</w:t>
+        <w:tab/>
+        <w:t>: {interface}</w:t>
+      </w:r>
+    </w:p>
+    <w:p>
+      <w:pPr>
+        <w:spacing w:after="0" w:line="240" w:lineRule="auto"/>
+        <w:jc w:val="both"/>
+        <w:rPr/>
+        <w:tabs>
+          <w:tab w:val="left" w:pos="3020"/>
+        </w:tabs>
+      </w:pPr>
+      <w:r>
+        <w:rPr>
+          <w:rtl w:val="0"/>
+        </w:rPr>
+        <w:t>Bandwidth</w:t>
+        <w:tab/>
+        <w:t>: {bandwidth}</w:t>
+      </w:r>
+    </w:p>
+    <w:p>
+      <w:pPr>
+        <w:spacing w:after="0" w:line="240" w:lineRule="auto"/>
+        <w:ind w:left="2127" w:hanging="2127"/>
+        <w:jc w:val="both"/>
+        <w:rPr/>
+        <w:tabs>
+          <w:tab w:val="left" w:pos="3020"/>
+        </w:tabs>
+      </w:pPr>
+      <w:r>
+        <w:rPr>
+          <w:rtl w:val="0"/>
+        </w:rPr>
+        <w:t>Originating</w:t>
+        <w:tab/>
+        <w:t>: {originating}</w:t>
+      </w:r>
+    </w:p>
+    <w:p>
+      <w:pPr>
+        <w:spacing w:after="0" w:line="240" w:lineRule="auto"/>
+        <w:ind w:left="2127" w:right="-755" w:hanging="2127"/>
+        <w:rPr/>
+        <w:tabs>
+          <w:tab w:val="left" w:pos="3020"/>
+        </w:tabs>
+      </w:pPr>
+      <w:r>
+        <w:rPr>
+          <w:rtl w:val="0"/>
+        </w:rPr>
+        <w:t>Terminating</w:t>
+        <w:tab/>
+        <w:t>: {terminating}</w:t>
+      </w:r>
+    </w:p>
+    <w:p>
+      <w:pPr>
+        <w:spacing w:after="0" w:line="240" w:lineRule="auto"/>
+        <w:ind w:left="2127" w:right="-755" w:hanging="2127"/>
+        <w:rPr/>
+        <w:tabs>
+          <w:tab w:val="left" w:pos="3020"/>
+        </w:tabs>
+      </w:pPr>
+      <w:r>
+        <w:rPr>
+          <w:rtl w:val="0"/>
+        </w:rPr>
+        <w:t>No PA</w:t>
+        <w:tab/>
+        <w:t>: {noPA}</w:t>
+      </w:r>
+    </w:p>
+    <w:p>
+      <w:pPr>
+        <w:spacing w:after="0" w:line="240" w:lineRule="auto"/>
+        <w:ind w:left="2127" w:right="-755" w:hanging="2127"/>
+        <w:rPr/>
+      </w:pPr>
+      <w:r>
+        <w:rPr>
+          <w:rtl w:val="0"/>
+        </w:rPr>
+      </w:r>
+    </w:p>
+    <w:p>
+      <w:pPr>
+        <w:spacing w:after="0" w:line="240" w:lineRule="auto"/>
+        <w:ind w:left="2127" w:hanging="2127"/>
+        <w:jc w:val="both"/>
+        <w:rPr/>
+        <w:tabs>
+          <w:tab w:val="left" w:pos="3020"/>
+        </w:tabs>
+      </w:pPr>
+      <w:r>
+        <w:rPr>
+          <w:rtl w:val="0"/>
+        </w:rPr>
+        <w:t>Nama Pelanggan</w:t>
+        <w:tab/>
+        <w:t>: {namaPelanggan}</w:t>
+      </w:r>
+    </w:p>
+    <w:p>
+      <w:pPr>
+        <w:tabs>
+          <w:tab w:val="left" w:leader="none" w:pos="3020"/>
+        </w:tabs>
+        <w:spacing w:after="0" w:line="240" w:lineRule="auto"/>
+        <w:ind w:left="2268" w:right="-755" w:firstLine="0"/>
+        <w:rPr/>
+      </w:pPr>
+      <w:r>
+        <w:rPr>
+          <w:rtl w:val="0"/>
+        </w:rPr>
+      </w:r>
+    </w:p>
+    <w:p>
+      <w:pPr>
+        <w:spacing w:after="0" w:line="240" w:lineRule="auto"/>
+        <w:jc w:val="both"/>
+        <w:rPr/>
+        <w:tabs>
+          <w:tab w:val="left" w:pos="3020"/>
+          <w:tab w:val="left" w:pos="6096"/>
+        </w:tabs>
+      </w:pPr>
+      <w:r>
+        <w:rPr>
+          <w:rtl w:val="0"/>
+        </w:rPr>
+        <w:t>Nama Perangkat</w:t>
+        <w:tab/>
+        <w:t>: {namaPerangkat}</w:t>
+        <w:tab/>
+        <w:t>SN: {snPerangkat}</w:t>
+      </w:r>
+    </w:p>
+    <w:p>
+      <w:pPr>
+        <w:spacing w:after="0" w:line="240" w:lineRule="auto"/>
+        <w:jc w:val="both"/>
+        <w:rPr/>
+        <w:tabs>
+          <w:tab w:val="left" w:pos="3020"/>
+        </w:tabs>
+      </w:pPr>
+      <w:r>
+        <w:rPr>
+          <w:rtl w:val="0"/>
+        </w:rPr>
+        <w:t>Alamat/Lokasi POP</w:t>
+        <w:tab/>
+        <w:t>: {alamatPOP}</w:t>
+      </w:r>
+    </w:p>
+    <w:p>
+      <w:pPr>
+        <w:spacing w:after="0" w:line="240" w:lineRule="auto"/>
+        <w:jc w:val="both"/>
+        <w:rPr/>
+        <w:tabs>
+          <w:tab w:val="left" w:pos="3020"/>
+        </w:tabs>
+      </w:pPr>
+      <w:r>
+        <w:rPr>
+          <w:rtl w:val="0"/>
+        </w:rPr>
+        <w:t>Koordinat POP</w:t>
+        <w:tab/>
+        <w:t>: {koordinatPOP}</w:t>
+      </w:r>
+    </w:p>
+    <w:p>
+      <w:pPr>
+        <w:spacing w:after="0" w:line="240" w:lineRule="auto"/>
+        <w:jc w:val="both"/>
+        <w:rPr/>
+        <w:tabs>
+          <w:tab w:val="left" w:pos="3020"/>
+          <w:tab w:val="left" w:pos="6096"/>
+        </w:tabs>
+      </w:pPr>
+      <w:r>
+        <w:rPr>
+          <w:rtl w:val="0"/>
+        </w:rPr>
+        <w:t>Nama Perangkat POP</w:t>
+        <w:tab/>
+        <w:t>: {namaPerangkatPOP}</w:t>
+        <w:tab/>
+        <w:t>SN: {snPOP}</w:t>
+      </w:r>
+    </w:p>
+    <w:p>
+      <w:pPr>
+        <w:spacing w:after="0" w:line="240" w:lineRule="auto"/>
+        <w:jc w:val="both"/>
+        <w:rPr/>
+        <w:tabs>
+          <w:tab w:val="left" w:pos="3020"/>
+        </w:tabs>
+      </w:pPr>
+      <w:r>
+        <w:rPr>
+          <w:rtl w:val="0"/>
+        </w:rPr>
+        <w:t>Kanal/Port</w:t>
+        <w:tab/>
+        <w:t>: {kanalPort}</w:t>
+      </w:r>
+    </w:p>
+    <w:p>
+      <w:pPr>
+        <w:spacing w:after="0" w:line="240" w:lineRule="auto"/>
+        <w:jc w:val="both"/>
+        <w:rPr/>
+        <w:tabs>
+          <w:tab w:val="left" w:pos="3020"/>
+        </w:tabs>
+      </w:pPr>
+      <w:r>
+        <w:rPr>
+          <w:rtl w:val="0"/>
+        </w:rPr>
+        <w:t>Jarak OTDR</w:t>
+        <w:tab/>
+        <w:t>: {jarakOTDR}</w:t>
+      </w:r>
+    </w:p>
+    <w:p>
+      <w:pPr>
+        <w:tabs>
+          <w:tab w:val="left" w:leader="none" w:pos="3020"/>
+        </w:tabs>
+        <w:spacing w:after="0" w:line="240" w:lineRule="auto"/>
+        <w:jc w:val="both"/>
+        <w:rPr/>
+      </w:pPr>
+      <w:r>
+        <w:rPr>
+          <w:rtl w:val="0"/>
+        </w:rPr>
+      </w:r>
+    </w:p>
+    <w:p>
+      <w:pPr>
+        <w:tabs>
+          <w:tab w:val="left" w:leader="none" w:pos="3020"/>
+        </w:tabs>
+        <w:spacing w:after="0" w:line="240" w:lineRule="auto"/>
+        <w:jc w:val="both"/>
         <w:rPr>
           <w:b w:val="1"/>
           <w:bCs w:val="1"/>
-          <w:rtl w:val="0"/>
-        </w:rPr>
-      </w:r>
-      <w:r>
-        <w:rPr>
-          <w:rtl w:val="0"/>
-        </w:rPr>
-      </w:r>
+        </w:rPr>
+      </w:pPr>
       <w:r>
         <w:rPr>
           <w:b w:val="1"/>
           <w:bCs w:val="1"/>
           <w:rtl w:val="0"/>
         </w:rPr>
-      </w:r>
-      <w:r>
-        <w:rPr>
-          <w:rtl w:val="0"/>
-        </w:rPr>
-      </w:r>
-      <w:r>
-        <w:rPr>
-          <w:b w:val="1"/>
-          <w:bCs w:val="1"/>
-          <w:rtl w:val="0"/>
-        </w:rPr>
-      </w:r>
-      <w:r>
-        <w:rPr>
-          <w:rtl w:val="0"/>
-        </w:rPr>
-      </w:r>
-      <w:r>
-        <w:rPr>
-          <w:b w:val="1"/>
-          <w:bCs w:val="1"/>
-          <w:rtl w:val="0"/>
-        </w:rPr>
-      </w:r>
-      <w:r>
-        <w:rPr>
-          <w:rtl w:val="0"/>
-        </w:rPr>
-      </w:r>
-      <w:r>
-        <w:rPr>
-          <w:b w:val="1"/>
-          <w:bCs w:val="1"/>
-          <w:rtl w:val="0"/>
-        </w:rPr>
-      </w:r>
-      <w:r>
-        <w:rPr>
-          <w:rtl w:val="0"/>
-        </w:rPr>
-      </w:r>
-    </w:p>
-    <w:p>
-      <w:pPr>
-        <w:spacing w:after="0" w:line="240" w:lineRule="auto"/>
-        <w:jc w:val="both"/>
-        <w:rPr/>
-      </w:pPr>
-      <w:r>
-        <w:rPr>
-          <w:rtl w:val="0"/>
-        </w:rPr>
-      </w:r>
-    </w:p>
-    <w:p>
-      <w:pPr>
-        <w:spacing w:after="0" w:line="240" w:lineRule="auto"/>
-        <w:jc w:val="both"/>
-        <w:rPr/>
-        <w:tabs>
-          <w:tab w:val="left" w:pos="2880"/>
-        </w:tabs>
-      </w:pPr>
-      <w:r>
-        <w:rPr>
-          <w:rtl w:val="0"/>
-        </w:rPr>
-        <w:t xml:space="preserve">Nama Layanan </w:t>
-        <w:tab/>
-        <w:t>: {namaLayanan}</w:t>
-      </w:r>
-    </w:p>
-    <w:p>
-      <w:pPr>
-        <w:spacing w:after="0" w:line="240" w:lineRule="auto"/>
-        <w:jc w:val="both"/>
-        <w:rPr/>
-        <w:tabs>
-          <w:tab w:val="left" w:pos="2880"/>
-        </w:tabs>
-      </w:pPr>
-      <w:r>
-        <w:rPr>
-          <w:rtl w:val="0"/>
-        </w:rPr>
-        <w:t>Service ID</w:t>
-        <w:tab/>
-        <w:t>: {serviceId}</w:t>
-      </w:r>
-    </w:p>
-    <w:p>
-      <w:pPr>
-        <w:spacing w:after="0" w:line="240" w:lineRule="auto"/>
-        <w:jc w:val="both"/>
-        <w:rPr/>
-        <w:tabs>
-          <w:tab w:val="left" w:pos="2880"/>
-        </w:tabs>
-      </w:pPr>
-      <w:r>
-        <w:rPr>
-          <w:rtl w:val="0"/>
-        </w:rPr>
-        <w:t>Interface</w:t>
-        <w:tab/>
-        <w:t>: {interface}</w:t>
-      </w:r>
-    </w:p>
-    <w:p>
-      <w:pPr>
-        <w:spacing w:after="0" w:line="240" w:lineRule="auto"/>
-        <w:jc w:val="both"/>
-        <w:rPr/>
-        <w:tabs>
-          <w:tab w:val="left" w:pos="2880"/>
-        </w:tabs>
-      </w:pPr>
-      <w:r>
-        <w:rPr>
-          <w:rtl w:val="0"/>
-        </w:rPr>
-        <w:t>Bandwidth</w:t>
-        <w:tab/>
-        <w:t>: {bandwidth}</w:t>
-      </w:r>
-    </w:p>
-    <w:p>
-      <w:pPr>
-        <w:spacing w:after="0" w:line="240" w:lineRule="auto"/>
-        <w:ind w:left="2127" w:hanging="2127"/>
-        <w:jc w:val="both"/>
-        <w:rPr/>
-        <w:tabs>
-          <w:tab w:val="left" w:pos="2880"/>
-        </w:tabs>
-      </w:pPr>
-      <w:r>
-        <w:rPr>
-          <w:rtl w:val="0"/>
-        </w:rPr>
-        <w:t>Originating</w:t>
-        <w:tab/>
-        <w:t>: {originating}</w:t>
-      </w:r>
-    </w:p>
-    <w:p>
-      <w:pPr>
-        <w:spacing w:after="0" w:line="240" w:lineRule="auto"/>
-        <w:ind w:left="2127" w:right="-755" w:hanging="2127"/>
-        <w:rPr/>
-        <w:tabs>
-          <w:tab w:val="left" w:pos="2880"/>
-        </w:tabs>
-      </w:pPr>
-      <w:r>
-        <w:rPr>
-          <w:rtl w:val="0"/>
-        </w:rPr>
-        <w:t>Terminating</w:t>
-        <w:tab/>
-        <w:t>: {terminating}</w:t>
-      </w:r>
-    </w:p>
-    <w:p>
-      <w:pPr>
-        <w:spacing w:after="0" w:line="240" w:lineRule="auto"/>
-        <w:ind w:left="2127" w:right="-755" w:hanging="2127"/>
-        <w:rPr/>
-        <w:tabs>
-          <w:tab w:val="left" w:pos="2880"/>
-        </w:tabs>
-      </w:pPr>
-      <w:r>
-        <w:rPr>
-          <w:rtl w:val="0"/>
-        </w:rPr>
-        <w:t>No PA</w:t>
-        <w:tab/>
-        <w:t>: {noPA}</w:t>
-      </w:r>
-    </w:p>
-    <w:p>
-      <w:pPr>
-        <w:spacing w:after="0" w:line="240" w:lineRule="auto"/>
-        <w:ind w:left="2127" w:right="-755" w:hanging="2127"/>
-        <w:rPr/>
-      </w:pPr>
-      <w:r>
-        <w:rPr>
-          <w:rtl w:val="0"/>
-        </w:rPr>
-      </w:r>
-    </w:p>
-    <w:p>
-      <w:pPr>
-        <w:spacing w:after="0" w:line="240" w:lineRule="auto"/>
-        <w:ind w:left="2127" w:hanging="2127"/>
-        <w:jc w:val="both"/>
-        <w:rPr/>
-        <w:tabs>
-          <w:tab w:val="left" w:pos="2880"/>
-        </w:tabs>
-      </w:pPr>
-      <w:r>
-        <w:rPr>
-          <w:rtl w:val="0"/>
-        </w:rPr>
-        <w:t>Nama Pelanggan</w:t>
-        <w:tab/>
-        <w:t>: {namaPelanggan}</w:t>
-      </w:r>
-    </w:p>
-    <w:p>
-      <w:pPr>
-        <w:tabs>
-          <w:tab w:val="left" w:leader="none" w:pos="2880"/>
-        </w:tabs>
-        <w:spacing w:after="0" w:line="240" w:lineRule="auto"/>
-        <w:ind w:left="2268" w:right="-755" w:firstLine="0"/>
-        <w:rPr/>
-      </w:pPr>
-      <w:r>
-        <w:rPr>
-          <w:rtl w:val="0"/>
-        </w:rPr>
-      </w:r>
-    </w:p>
-    <w:p>
-      <w:pPr>
-        <w:spacing w:after="0" w:line="240" w:lineRule="auto"/>
-        <w:jc w:val="both"/>
-        <w:rPr/>
-        <w:tabs>
-          <w:tab w:val="left" w:pos="2880"/>
-        </w:tabs>
-      </w:pPr>
-      <w:r>
-        <w:rPr>
-          <w:rtl w:val="0"/>
-        </w:rPr>
-        <w:t>Nama Perangkat</w:t>
-        <w:tab/>
-        <w:t>: {namaPerangkat}</w:t>
-        <w:tab/>
-        <w:t>SN: {snPerangkat}</w:t>
-      </w:r>
-    </w:p>
-    <w:p>
-      <w:pPr>
-        <w:spacing w:after="0" w:line="240" w:lineRule="auto"/>
-        <w:jc w:val="both"/>
-        <w:rPr/>
-        <w:tabs>
-          <w:tab w:val="left" w:pos="2880"/>
-        </w:tabs>
-      </w:pPr>
-      <w:r>
-        <w:rPr>
-          <w:rtl w:val="0"/>
-        </w:rPr>
-        <w:t>Alamat/Lokasi POP</w:t>
-        <w:tab/>
-        <w:t>: {alamatPOP}</w:t>
-      </w:r>
-    </w:p>
-    <w:p>
-      <w:pPr>
-        <w:spacing w:after="0" w:line="240" w:lineRule="auto"/>
-        <w:jc w:val="both"/>
-        <w:rPr/>
-        <w:tabs>
-          <w:tab w:val="left" w:pos="2880"/>
-        </w:tabs>
-      </w:pPr>
-      <w:r>
-        <w:rPr>
-          <w:rtl w:val="0"/>
-        </w:rPr>
-        <w:t>Koordinat POP</w:t>
-        <w:tab/>
-        <w:t>: {koordinatPOP}</w:t>
-      </w:r>
-    </w:p>
-    <w:p>
-      <w:pPr>
-        <w:spacing w:after="0" w:line="240" w:lineRule="auto"/>
-        <w:jc w:val="both"/>
-        <w:rPr/>
-        <w:tabs>
-          <w:tab w:val="left" w:pos="2880"/>
-        </w:tabs>
-      </w:pPr>
-      <w:r>
-        <w:rPr>
-          <w:rtl w:val="0"/>
-        </w:rPr>
-        <w:t>Nama Perangkat POP</w:t>
-        <w:tab/>
-        <w:t>: {namaPerangkatPOP}</w:t>
-        <w:tab/>
-        <w:t>SN: {snPOP}</w:t>
-      </w:r>
-    </w:p>
-    <w:p>
-      <w:pPr>
-        <w:spacing w:after="0" w:line="240" w:lineRule="auto"/>
-        <w:jc w:val="both"/>
-        <w:rPr/>
-        <w:tabs>
-          <w:tab w:val="left" w:pos="2880"/>
-        </w:tabs>
-      </w:pPr>
-      <w:r>
-        <w:rPr>
-          <w:rtl w:val="0"/>
-        </w:rPr>
-        <w:t>Kanal/Port</w:t>
-        <w:tab/>
-        <w:t>: {kanalPort}</w:t>
-      </w:r>
-    </w:p>
-    <w:p>
-      <w:pPr>
-        <w:spacing w:after="0" w:line="240" w:lineRule="auto"/>
-        <w:jc w:val="both"/>
-        <w:rPr/>
-        <w:tabs>
-          <w:tab w:val="left" w:pos="2880"/>
-        </w:tabs>
-      </w:pPr>
-      <w:r>
-        <w:rPr>
-          <w:rtl w:val="0"/>
-        </w:rPr>
-        <w:t>Jarak OTDR</w:t>
-        <w:tab/>
-        <w:t>: {jarakOTDR}</w:t>
-      </w:r>
-    </w:p>
-    <w:p>
-      <w:pPr>
-        <w:tabs>
-          <w:tab w:val="left" w:leader="none" w:pos="2880"/>
-        </w:tabs>
-        <w:spacing w:after="0" w:line="240" w:lineRule="auto"/>
-        <w:jc w:val="both"/>
-        <w:rPr/>
-      </w:pPr>
-      <w:r>
-        <w:rPr>
-          <w:rtl w:val="0"/>
-        </w:rPr>
-      </w:r>
-    </w:p>
-    <w:p>
-      <w:pPr>
-        <w:tabs>
-          <w:tab w:val="left" w:leader="none" w:pos="2880"/>
-        </w:tabs>
-        <w:spacing w:after="0" w:line="240" w:lineRule="auto"/>
-        <w:jc w:val="both"/>
-        <w:rPr>
-          <w:b w:val="1"/>
-          <w:bCs w:val="1"/>
-        </w:rPr>
-      </w:pPr>
-      <w:r>
-        <w:rPr>
-          <w:b w:val="1"/>
-          <w:bCs w:val="1"/>
-          <w:rtl w:val="0"/>
-        </w:rPr>
         <w:t xml:space="preserve">Yang Diwakili oleh Pelanggan</w:t>
       </w:r>
     </w:p>
@@ -431,7 +444,7 @@
         <w:jc w:val="both"/>
         <w:rPr/>
         <w:tabs>
-          <w:tab w:val="left" w:pos="2880"/>
+          <w:tab w:val="left" w:pos="3020"/>
         </w:tabs>
       </w:pPr>
       <w:r>
@@ -449,7 +462,7 @@
         <w:jc w:val="both"/>
         <w:rPr/>
         <w:tabs>
-          <w:tab w:val="left" w:pos="2880"/>
+          <w:tab w:val="left" w:pos="3020"/>
         </w:tabs>
       </w:pPr>
       <w:r>
@@ -467,7 +480,7 @@
         <w:jc w:val="both"/>
         <w:rPr/>
         <w:tabs>
-          <w:tab w:val="left" w:pos="2880"/>
+          <w:tab w:val="left" w:pos="3020"/>
         </w:tabs>
       </w:pPr>
       <w:r>
@@ -482,7 +495,7 @@
     <w:p>
       <w:pPr>
         <w:tabs>
-          <w:tab w:val="left" w:leader="none" w:pos="2880"/>
+          <w:tab w:val="left" w:leader="none" w:pos="3020"/>
         </w:tabs>
         <w:spacing w:after="0" w:line="240" w:lineRule="auto"/>
         <w:jc w:val="both"/>
@@ -637,6 +650,7 @@
             </w:pPr>
             <w:r>
               <w:rPr>
+                <w:b/>
                 <w:rtl w:val="0"/>
               </w:rPr>
               <w:t>{instansiPelanggan}</w:t>
@@ -691,6 +705,14 @@
                 <w:rtl w:val="0"/>
               </w:rPr>
             </w:r>
+            <w:r>
+              <w:t>{%ttd2}</w:t>
+            </w:r>
+          </w:p>
+          <w:p>
+            <w:r>
+              <w:t>{%stempel2}</w:t>
+            </w:r>
           </w:p>
         </w:tc>
         <w:tc>
@@ -725,6 +747,7 @@
           <w:tcPr>
             <w:vAlign w:val="center"/>
           </w:tcPr>
+          <w:p/>
           <w:p>
             <w:pPr>
               <w:jc w:val="center"/>

</xml_diff>

<commit_message>
fix(BAI): second Terminating row + hanging indent for long-value wrapping
- Insert a second Terminating row after Nama Pelanggan (mirrors customer
  master layout); idempotent — skips if already present (UID_JABAR).
- Hanging indent (left=2880 hanging=2880) on Originating/Terminating rows
  so long addresses wrap back under the value column, not the left margin.
  Hanging position == tab stop, so colons stay aligned.

Co-Authored-By: Claude Opus 4.8 <noreply@anthropic.com>
</commit_message>
<xml_diff>
--- a/templates/docx/BAI.docx
+++ b/templates/docx/BAI.docx
@@ -192,6 +192,7 @@
         <w:spacing w:after="0" w:line="240" w:lineRule="auto"/>
         <w:jc w:val="both"/>
         <w:rPr/>
+        <w:ind w:left="2880" w:hanging="2880"/>
         <w:tabs>
           <w:tab w:val="left" w:pos="2880"/>
         </w:tabs>
@@ -209,6 +210,7 @@
       <w:pPr>
         <w:spacing w:after="0" w:line="240" w:lineRule="auto"/>
         <w:rPr/>
+        <w:ind w:left="2880" w:hanging="2880"/>
         <w:tabs>
           <w:tab w:val="left" w:pos="2880"/>
         </w:tabs>
@@ -267,6 +269,24 @@
         <w:t>Nama Pelanggan</w:t>
         <w:tab/>
         <w:t>: {namaPelanggan}</w:t>
+      </w:r>
+    </w:p>
+    <w:p>
+      <w:pPr>
+        <w:spacing w:after="0" w:line="240" w:lineRule="auto"/>
+        <w:rPr/>
+        <w:ind w:left="2880" w:hanging="2880"/>
+        <w:tabs>
+          <w:tab w:val="left" w:pos="2880"/>
+        </w:tabs>
+      </w:pPr>
+      <w:r>
+        <w:rPr>
+          <w:rtl w:val="0"/>
+        </w:rPr>
+        <w:t>Terminating</w:t>
+        <w:tab/>
+        <w:t>: {terminating}</w:t>
       </w:r>
     </w:p>
     <w:p>

</xml_diff>

<commit_message>
fix: bold only the opening sentence in BAI and BAI UID JABAR
Corrects 446c531. That commit bolded {namaLayanan} in two places, following
the answer "both" to my question about where it belonged. The actual rule is
narrower: only the opening sentence is bolded.

- BAI: {disewakanOleh} moves into its own bold run, joining {namaLayanan} and
  the {hari}/{tanggal}/{bulan}/{tahun}/BAIK that were already bold there.
- BAI and UID JABAR: the "Nama Layanan : " spec line goes back to plain. UID
  JABAR's opening sentence carries no service name, so only its spec line
  changes — and that restores what its master already had.

No tags added or removed; this is purely run formatting. Both templates still
render as one page.

Co-Authored-By: Claude Opus 5 <noreply@anthropic.com>
</commit_message>
<xml_diff>
--- a/templates/docx/BAI.docx
+++ b/templates/docx/BAI.docx
@@ -100,13 +100,27 @@
           <w:b w:val="0"/>
           <w:rtl w:val="0"/>
         </w:rPr>
-        <w:t xml:space="preserve"> yang disewa oleh {disewakanOleh} Dengan hasil </w:t>
+        <w:t xml:space="preserve"> yang disewa oleh </w:t>
       </w:r>
       <w:r>
         <w:rPr>
           <w:b/>
           <w:rtl w:val="0"/>
         </w:rPr>
+        <w:t>{disewakanOleh}</w:t>
+      </w:r>
+      <w:r>
+        <w:rPr>
+          <w:b w:val="0"/>
+          <w:rtl w:val="0"/>
+        </w:rPr>
+        <w:t xml:space="preserve"> Dengan hasil </w:t>
+      </w:r>
+      <w:r>
+        <w:rPr>
+          <w:b/>
+          <w:rtl w:val="0"/>
+        </w:rPr>
         <w:t>BAIK</w:t>
       </w:r>
       <w:r>
@@ -149,7 +163,6 @@
       </w:r>
       <w:r>
         <w:rPr>
-          <w:b/>
           <w:rtl w:val="0"/>
         </w:rPr>
         <w:t>{namaLayanan}</w:t>

</xml_diff>

<commit_message>
fix: reorder pPr children so Word can open BAI/BAP/Surat Tugas, join Surat Tugas ttd+stempel
Word requires <w:rPr> last inside <w:pPr> (CT_PPr is a sequence); BAI and BAP
had put <w:tabs>/<w:ind> after it, which LibreOffice tolerated but Word
rejected outright. Surat Tugas's ttd and stempel also sat in separate stacked
paragraphs with three blank lines before the name, same class of defect
already fixed in BAST/BAKL.
</commit_message>
<xml_diff>
--- a/templates/docx/BAI.docx
+++ b/templates/docx/BAI.docx
@@ -144,12 +144,12 @@
     </w:p>
     <w:p>
       <w:pPr>
-        <w:spacing w:after="0" w:line="240" w:lineRule="auto"/>
-        <w:ind w:left="2400" w:hanging="2400"/>
-        <w:rPr/>
-        <w:tabs>
-          <w:tab w:val="left" w:pos="2400"/>
-        </w:tabs>
+        <w:tabs>
+          <w:tab w:val="left" w:pos="2400"/>
+        </w:tabs>
+        <w:spacing w:after="0" w:line="240" w:lineRule="auto"/>
+        <w:ind w:left="2400" w:hanging="2400"/>
+        <w:rPr/>
       </w:pPr>
       <w:r>
         <w:rPr>
@@ -168,12 +168,12 @@
     </w:p>
     <w:p>
       <w:pPr>
-        <w:spacing w:after="0" w:line="240" w:lineRule="auto"/>
-        <w:ind w:left="2400" w:hanging="2400"/>
-        <w:rPr/>
-        <w:tabs>
-          <w:tab w:val="left" w:pos="2400"/>
-        </w:tabs>
+        <w:tabs>
+          <w:tab w:val="left" w:pos="2400"/>
+        </w:tabs>
+        <w:spacing w:after="0" w:line="240" w:lineRule="auto"/>
+        <w:ind w:left="2400" w:hanging="2400"/>
+        <w:rPr/>
       </w:pPr>
       <w:r>
         <w:rPr>
@@ -186,12 +186,12 @@
     </w:p>
     <w:p>
       <w:pPr>
-        <w:spacing w:after="0" w:line="240" w:lineRule="auto"/>
-        <w:ind w:left="2400" w:hanging="2400"/>
-        <w:rPr/>
-        <w:tabs>
-          <w:tab w:val="left" w:pos="2400"/>
-        </w:tabs>
+        <w:tabs>
+          <w:tab w:val="left" w:pos="2400"/>
+        </w:tabs>
+        <w:spacing w:after="0" w:line="240" w:lineRule="auto"/>
+        <w:ind w:left="2400" w:hanging="2400"/>
+        <w:rPr/>
       </w:pPr>
       <w:r>
         <w:rPr>
@@ -204,12 +204,12 @@
     </w:p>
     <w:p>
       <w:pPr>
-        <w:spacing w:after="0" w:line="240" w:lineRule="auto"/>
-        <w:ind w:left="2400" w:hanging="2400"/>
-        <w:rPr/>
-        <w:tabs>
-          <w:tab w:val="left" w:pos="2400"/>
-        </w:tabs>
+        <w:tabs>
+          <w:tab w:val="left" w:pos="2400"/>
+        </w:tabs>
+        <w:spacing w:after="0" w:line="240" w:lineRule="auto"/>
+        <w:ind w:left="2400" w:hanging="2400"/>
+        <w:rPr/>
       </w:pPr>
       <w:r>
         <w:rPr>
@@ -222,12 +222,12 @@
     </w:p>
     <w:p>
       <w:pPr>
-        <w:spacing w:after="0" w:line="240" w:lineRule="auto"/>
-        <w:rPr/>
-        <w:ind w:left="2400" w:hanging="2400"/>
-        <w:tabs>
-          <w:tab w:val="left" w:pos="2400"/>
-        </w:tabs>
+        <w:tabs>
+          <w:tab w:val="left" w:pos="2400"/>
+        </w:tabs>
+        <w:spacing w:after="0" w:line="240" w:lineRule="auto"/>
+        <w:ind w:left="2400" w:hanging="2400"/>
+        <w:rPr/>
       </w:pPr>
       <w:r>
         <w:rPr>
@@ -240,12 +240,12 @@
     </w:p>
     <w:p>
       <w:pPr>
-        <w:spacing w:after="0" w:line="240" w:lineRule="auto"/>
-        <w:rPr/>
-        <w:ind w:left="2400" w:hanging="2400"/>
-        <w:tabs>
-          <w:tab w:val="left" w:pos="2400"/>
-        </w:tabs>
+        <w:tabs>
+          <w:tab w:val="left" w:pos="2400"/>
+        </w:tabs>
+        <w:spacing w:after="0" w:line="240" w:lineRule="auto"/>
+        <w:ind w:left="2400" w:hanging="2400"/>
+        <w:rPr/>
       </w:pPr>
       <w:r>
         <w:rPr>
@@ -258,12 +258,12 @@
     </w:p>
     <w:p>
       <w:pPr>
-        <w:spacing w:after="0" w:line="240" w:lineRule="auto"/>
-        <w:ind w:left="2400" w:hanging="2400"/>
-        <w:rPr/>
-        <w:tabs>
-          <w:tab w:val="left" w:pos="2400"/>
-        </w:tabs>
+        <w:tabs>
+          <w:tab w:val="left" w:pos="2400"/>
+        </w:tabs>
+        <w:spacing w:after="0" w:line="240" w:lineRule="auto"/>
+        <w:ind w:left="2400" w:hanging="2400"/>
+        <w:rPr/>
       </w:pPr>
       <w:r>
         <w:rPr>
@@ -288,12 +288,12 @@
     </w:p>
     <w:p>
       <w:pPr>
-        <w:spacing w:after="0" w:line="240" w:lineRule="auto"/>
-        <w:ind w:left="2400" w:hanging="2400"/>
-        <w:rPr/>
-        <w:tabs>
-          <w:tab w:val="left" w:pos="2400"/>
-        </w:tabs>
+        <w:tabs>
+          <w:tab w:val="left" w:pos="2400"/>
+        </w:tabs>
+        <w:spacing w:after="0" w:line="240" w:lineRule="auto"/>
+        <w:ind w:left="2400" w:hanging="2400"/>
+        <w:rPr/>
       </w:pPr>
       <w:r>
         <w:rPr>
@@ -306,12 +306,12 @@
     </w:p>
     <w:p>
       <w:pPr>
-        <w:spacing w:after="0" w:line="240" w:lineRule="auto"/>
-        <w:rPr/>
-        <w:ind w:left="2400" w:hanging="2400"/>
-        <w:tabs>
-          <w:tab w:val="left" w:pos="2400"/>
-        </w:tabs>
+        <w:tabs>
+          <w:tab w:val="left" w:pos="2400"/>
+        </w:tabs>
+        <w:spacing w:after="0" w:line="240" w:lineRule="auto"/>
+        <w:ind w:left="2400" w:hanging="2400"/>
+        <w:rPr/>
       </w:pPr>
       <w:r>
         <w:rPr>
@@ -339,13 +339,13 @@
     </w:p>
     <w:p>
       <w:pPr>
-        <w:spacing w:after="0" w:line="240" w:lineRule="auto"/>
-        <w:ind w:left="2400" w:hanging="2400"/>
-        <w:rPr/>
         <w:tabs>
           <w:tab w:val="left" w:pos="2400"/>
           <w:tab w:val="left" w:pos="5760"/>
         </w:tabs>
+        <w:spacing w:after="0" w:line="240" w:lineRule="auto"/>
+        <w:ind w:left="2400" w:hanging="2400"/>
+        <w:rPr/>
       </w:pPr>
       <w:r>
         <w:rPr>
@@ -360,12 +360,12 @@
     </w:p>
     <w:p>
       <w:pPr>
-        <w:spacing w:after="0" w:line="240" w:lineRule="auto"/>
-        <w:ind w:left="2400" w:hanging="2400"/>
-        <w:rPr/>
-        <w:tabs>
-          <w:tab w:val="left" w:pos="2400"/>
-        </w:tabs>
+        <w:tabs>
+          <w:tab w:val="left" w:pos="2400"/>
+        </w:tabs>
+        <w:spacing w:after="0" w:line="240" w:lineRule="auto"/>
+        <w:ind w:left="2400" w:hanging="2400"/>
+        <w:rPr/>
       </w:pPr>
       <w:r>
         <w:rPr>
@@ -378,12 +378,12 @@
     </w:p>
     <w:p>
       <w:pPr>
-        <w:spacing w:after="0" w:line="240" w:lineRule="auto"/>
-        <w:ind w:left="2400" w:hanging="2400"/>
-        <w:rPr/>
-        <w:tabs>
-          <w:tab w:val="left" w:pos="2400"/>
-        </w:tabs>
+        <w:tabs>
+          <w:tab w:val="left" w:pos="2400"/>
+        </w:tabs>
+        <w:spacing w:after="0" w:line="240" w:lineRule="auto"/>
+        <w:ind w:left="2400" w:hanging="2400"/>
+        <w:rPr/>
       </w:pPr>
       <w:r>
         <w:rPr>
@@ -396,13 +396,13 @@
     </w:p>
     <w:p>
       <w:pPr>
-        <w:spacing w:after="0" w:line="240" w:lineRule="auto"/>
-        <w:ind w:left="2400" w:hanging="2400"/>
-        <w:rPr/>
         <w:tabs>
           <w:tab w:val="left" w:pos="2400"/>
           <w:tab w:val="left" w:pos="5760"/>
         </w:tabs>
+        <w:spacing w:after="0" w:line="240" w:lineRule="auto"/>
+        <w:ind w:left="2400" w:hanging="2400"/>
+        <w:rPr/>
       </w:pPr>
       <w:r>
         <w:rPr>
@@ -417,12 +417,12 @@
     </w:p>
     <w:p>
       <w:pPr>
-        <w:spacing w:after="0" w:line="240" w:lineRule="auto"/>
-        <w:ind w:left="2400" w:hanging="2400"/>
-        <w:rPr/>
-        <w:tabs>
-          <w:tab w:val="left" w:pos="2400"/>
-        </w:tabs>
+        <w:tabs>
+          <w:tab w:val="left" w:pos="2400"/>
+        </w:tabs>
+        <w:spacing w:after="0" w:line="240" w:lineRule="auto"/>
+        <w:ind w:left="2400" w:hanging="2400"/>
+        <w:rPr/>
       </w:pPr>
       <w:r>
         <w:rPr>
@@ -435,12 +435,12 @@
     </w:p>
     <w:p>
       <w:pPr>
-        <w:spacing w:after="0" w:line="240" w:lineRule="auto"/>
-        <w:ind w:left="2400" w:hanging="2400"/>
-        <w:rPr/>
-        <w:tabs>
-          <w:tab w:val="left" w:pos="2400"/>
-        </w:tabs>
+        <w:tabs>
+          <w:tab w:val="left" w:pos="2400"/>
+        </w:tabs>
+        <w:spacing w:after="0" w:line="240" w:lineRule="auto"/>
+        <w:ind w:left="2400" w:hanging="2400"/>
+        <w:rPr/>
       </w:pPr>
       <w:r>
         <w:rPr>
@@ -487,12 +487,12 @@
     </w:p>
     <w:p>
       <w:pPr>
-        <w:spacing w:after="0" w:line="240" w:lineRule="auto"/>
-        <w:ind w:left="2400" w:hanging="2400"/>
-        <w:rPr/>
-        <w:tabs>
-          <w:tab w:val="left" w:pos="2400"/>
-        </w:tabs>
+        <w:tabs>
+          <w:tab w:val="left" w:pos="2400"/>
+        </w:tabs>
+        <w:spacing w:after="0" w:line="240" w:lineRule="auto"/>
+        <w:ind w:left="2400" w:hanging="2400"/>
+        <w:rPr/>
       </w:pPr>
       <w:r>
         <w:rPr>
@@ -505,12 +505,12 @@
     </w:p>
     <w:p>
       <w:pPr>
-        <w:spacing w:after="0" w:line="240" w:lineRule="auto"/>
-        <w:ind w:left="2400" w:hanging="2400"/>
-        <w:rPr/>
-        <w:tabs>
-          <w:tab w:val="left" w:pos="2400"/>
-        </w:tabs>
+        <w:tabs>
+          <w:tab w:val="left" w:pos="2400"/>
+        </w:tabs>
+        <w:spacing w:after="0" w:line="240" w:lineRule="auto"/>
+        <w:ind w:left="2400" w:hanging="2400"/>
+        <w:rPr/>
       </w:pPr>
       <w:r>
         <w:rPr>
@@ -523,12 +523,12 @@
     </w:p>
     <w:p>
       <w:pPr>
-        <w:spacing w:after="0" w:line="240" w:lineRule="auto"/>
-        <w:ind w:left="2400" w:hanging="2400"/>
-        <w:rPr/>
-        <w:tabs>
-          <w:tab w:val="left" w:pos="2400"/>
-        </w:tabs>
+        <w:tabs>
+          <w:tab w:val="left" w:pos="2400"/>
+        </w:tabs>
+        <w:spacing w:after="0" w:line="240" w:lineRule="auto"/>
+        <w:ind w:left="2400" w:hanging="2400"/>
+        <w:rPr/>
       </w:pPr>
       <w:r>
         <w:rPr>
@@ -541,12 +541,12 @@
     </w:p>
     <w:p>
       <w:pPr>
-        <w:spacing w:after="0" w:line="240" w:lineRule="auto"/>
-        <w:ind w:left="2400" w:hanging="2400"/>
-        <w:rPr/>
-        <w:tabs>
-          <w:tab w:val="left" w:pos="2400"/>
-        </w:tabs>
+        <w:tabs>
+          <w:tab w:val="left" w:pos="2400"/>
+        </w:tabs>
+        <w:spacing w:after="0" w:line="240" w:lineRule="auto"/>
+        <w:ind w:left="2400" w:hanging="2400"/>
+        <w:rPr/>
       </w:pPr>
       <w:r>
         <w:rPr>

</xml_diff>